<commit_message>
Update Olist analytics project with reports and notebook
</commit_message>
<xml_diff>
--- a/business_case/Business_Recommendations.docx
+++ b/business_case/Business_Recommendations.docx
@@ -57,7 +57,7 @@
           <w:sz w:val="21"/>
           <w:szCs w:val="21"/>
         </w:rPr>
-        <w:t xml:space="preserve">This document presents four evidence-based recommendations arising from an end-to-end analysis covering revenue, logistics, seller performance, and data quality across 96,478 delivered orders. Every figure below traces directly to a validated SQL query or dashboard measure; no financial projections beyond what the data supports are included.</w:t>
+        <w:t xml:space="preserve">This document presents four evidence-based recommendations arising from an end-to-end analysis covering revenue, logistics, seller performance, and data quality across 96,478 delivered orders. Every figure below traces to a SQL view in sql/08_business_findings.sql or a query in sql/04-05, and was reproduced from the source data in the October 2026 audit; no financial projections beyond what the data supports are included.</w:t>
       </w:r>
     </w:p>
     <w:p>
@@ -65,7 +65,7 @@
         <w:pBdr>
           <w:bottom w:val="single" w:color="1F4E5F" w:sz="6" w:space="4"/>
         </w:pBdr>
-        <w:spacing w:after="100" w:before="320"/>
+        <w:spacing w:before="320" w:after="100"/>
       </w:pPr>
       <w:r>
         <w:rPr>
@@ -75,7 +75,7 @@
           <w:sz w:val="26"/>
           <w:szCs w:val="26"/>
         </w:rPr>
-        <w:t xml:space="preserve">1. Fix the Northeast (Nordeste) delivery gap — a distance-driven logistics problem, not a seller problem</w:t>
+        <w:t xml:space="preserve">1. Fix the Northeast (Nordeste) delivery gap — most likely a regional logistics problem, not a seller problem</w:t>
       </w:r>
     </w:p>
     <w:p>
@@ -107,7 +107,7 @@
         <w:t xml:space="preserve">Evidence:  </w:t>
       </w:r>
       <w:r>
-        <w:t xml:space="preserve">Nordeste represents 9.38% of all delivered orders but 16.55% of all late deliveries (a 1.76x concentration), with a 14.31% late rate versus the 8.11% platform average, consistent across all 9 Nordeste states individually. Breaking sellers down by their origin state shows the pattern is distance-driven: sellers shipping from within or near Nordeste (Bahia 8.62%, Pernambuco 4.67%) perform near or better than the platform average, while sellers shipping from the distant São Paulo hub run 15.01% late specifically on this route — no individual seller has enough order volume to explain the pattern alone.</w:t>
+        <w:t xml:space="preserve">Nordeste represents 9.37% of delivered orders but 16.56% of late deliveries, with a 14.33% late rate versus the 8.11% platform average (1.77x); all 9 Nordeste states are individually above the platform rate, and the worst run at 2-3x (Alagoas 23.93%, Maranhão 19.67%). By seller origin, São Paulo sellers run 15.03% late on deliveries into Nordeste (n=6,374), and Bahia (8.62%) and Pernambuco (4.67%) sellers do better — consistent with a distance effect. The evidence is not uniform: Maranhão-based sellers run 29.33% late (n=75), so distance is the leading hypothesis rather than an established cause. No individual seller has enough volume to explain the pattern alone.</w:t>
       </w:r>
     </w:p>
     <w:p>
@@ -123,7 +123,7 @@
         <w:t xml:space="preserve">Business impact:  </w:t>
       </w:r>
       <w:r>
-        <w:t xml:space="preserve">Late deliveries are associated with a 1.738-point average review score gap (4.284 on-time vs. 2.546 late). If Nordeste's late rate matched the platform average, an estimated 561 orders per the analyzed period would shift from late to on-time.</w:t>
+        <w:t xml:space="preserve">Late deliveries are associated with a 1.73-point average review score gap (4.29 on-time vs. 2.57 late). If Nordeste's late rate matched the platform average, about 563 orders over the analyzed period would have been on time instead of late.</w:t>
       </w:r>
     </w:p>
     <w:p>
@@ -163,7 +163,7 @@
         <w:pBdr>
           <w:bottom w:val="single" w:color="1F4E5F" w:sz="6" w:space="4"/>
         </w:pBdr>
-        <w:spacing w:after="100" w:before="320"/>
+        <w:spacing w:before="320" w:after="100"/>
       </w:pPr>
       <w:r>
         <w:rPr>
@@ -205,7 +205,7 @@
         <w:t xml:space="preserve">Evidence:  </w:t>
       </w:r>
       <w:r>
-        <w:t xml:space="preserve">212 sellers (of 818 with sufficient order volume) fall into the 'high revenue, low performance' quadrant, generating R$5,366,989 in item revenue — more than the 197 sellers in the 'high revenue, high performance' quadrant (R$4,411,381). This group averages 89.1% on-time delivery and a 3.89 review score, versus 95.4% and 4.30 for the high-performing group. This includes the platform's single largest seller by revenue.</w:t>
+        <w:t xml:space="preserve">207 sellers (of 804 with at least 20 delivered orders) fall into the 'high revenue, low performance' quadrant, generating R$5,403,117 in delivered item revenue — more than the 195 sellers in the 'high revenue, high performance' quadrant (R$4,132,924). This group averages 89.1% on-time delivery and a 3.96 review score, versus 95.5% and 4.34 for the high-performing group, and includes the platform's single largest seller by revenue. (An earlier version of this analysis reported 212 sellers / R$5.37M; the headcount varies between 206 and 213 depending on the exact definition, and this quadrant is the largest revenue block under every definition tested.)</w:t>
       </w:r>
     </w:p>
     <w:p>
@@ -237,7 +237,7 @@
         <w:t xml:space="preserve">Recommendation:  </w:t>
       </w:r>
       <w:r>
-        <w:t xml:space="preserve">Launch a structured seller-success outreach program targeted at these 212 sellers: fulfillment coaching, a defined improvement checkpoint, and using the high-performing quadrant's practices as a benchmark. This should be a retention-and-improvement program, not a removal policy.</w:t>
+        <w:t xml:space="preserve">Launch a structured seller-success outreach program targeted at these ~207 sellers: fulfillment coaching, a defined improvement checkpoint, and using the high-performing quadrant's practices as a benchmark. This should be a retention-and-improvement program, not a removal policy.</w:t>
       </w:r>
     </w:p>
     <w:p>
@@ -253,7 +253,7 @@
         <w:t xml:space="preserve">Expected outcome:  </w:t>
       </w:r>
       <w:r>
-        <w:t xml:space="preserve">Movement of underperforming high-revenue sellers toward the platform's on-time/review benchmarks, protecting the R$5.37M in revenue currently at elevated risk. Success should be measured by re-running the quadrant segmentation quarterly and tracking how many sellers migrate to the high-performance quadrant.</w:t>
+        <w:t xml:space="preserve">Movement of underperforming high-revenue sellers toward the platform's on-time/review benchmarks, protecting the ~R$5.4M in revenue currently at elevated risk. Success should be measured by re-running the quadrant segmentation quarterly and tracking how many sellers migrate to the high-performance quadrant.</w:t>
       </w:r>
     </w:p>
     <w:p>
@@ -261,7 +261,7 @@
         <w:pBdr>
           <w:bottom w:val="single" w:color="1F4E5F" w:sz="6" w:space="4"/>
         </w:pBdr>
-        <w:spacing w:after="100" w:before="320"/>
+        <w:spacing w:before="320" w:after="100"/>
       </w:pPr>
       <w:r>
         <w:rPr>
@@ -303,7 +303,7 @@
         <w:t xml:space="preserve">Evidence:  </w:t>
       </w:r>
       <w:r>
-        <w:t xml:space="preserve">office_furniture has the lowest average review score of any category with meaningful volume (3.50, n=1,254), the highest late-delivery rate in the Nordeste-specific breakdown (17.61%), and the highest freight-cost exposure of any major category (25.01% of item revenue), each identified independently across separate phases of this analysis without being pre-selected as a hypothesis.</w:t>
+        <w:t xml:space="preserve">office_furniture has the lowest average review score of any category with meaningful volume (3.62, n=1,244 delivered orders with a review), the highest late-delivery rate in the Nordeste-specific breakdown (17.61%, though on a small sample of 142 orders and only marginally above health_beauty at 17.55%), and the highest freight-cost exposure of any major category (freight equal to 25.01% of item revenue).</w:t>
       </w:r>
     </w:p>
     <w:p>
@@ -359,7 +359,7 @@
         <w:pBdr>
           <w:bottom w:val="single" w:color="1F4E5F" w:sz="6" w:space="4"/>
         </w:pBdr>
-        <w:spacing w:after="100" w:before="320"/>
+        <w:spacing w:before="320" w:after="100"/>
       </w:pPr>
       <w:r>
         <w:rPr>
@@ -369,7 +369,7 @@
           <w:sz w:val="26"/>
           <w:szCs w:val="26"/>
         </w:rPr>
-        <w:t xml:space="preserve">4. Target loyalty investment at high-value customers, not geography</w:t>
+        <w:t xml:space="preserve">4. Test (don't assume) retention outreach for high-value customers</w:t>
       </w:r>
     </w:p>
     <w:p>
@@ -385,7 +385,7 @@
         <w:t xml:space="preserve">Observation:  </w:t>
       </w:r>
       <w:r>
-        <w:t xml:space="preserve">Repeat-purchase behavior on the platform is low overall (3.00%) and does not vary meaningfully by customer location, but it does vary sharply by spend level.</w:t>
+        <w:t xml:space="preserve">Repeat-purchase behavior on the platform is low overall (3.00%) and does not vary meaningfully by customer location. It is higher in the top lifetime-spend tier, but that gradient is largely a by-product of how lifetime spend is measured.</w:t>
       </w:r>
     </w:p>
     <w:p>
@@ -401,7 +401,7 @@
         <w:t xml:space="preserve">Evidence:  </w:t>
       </w:r>
       <w:r>
-        <w:t xml:space="preserve">97.0% of customers have exactly one order, and repeat rate sits in a narrow 2.9%-3.4% band across every major state — no geographic pattern. However, the top 5% of customers by total spend (≥R$420) repeat at 8.52%, compared to 4.80% for mid-value customers and just 0.97% for the bottom half of spenders by value.</w:t>
+        <w:t xml:space="preserve">97.0% of customers have exactly one order, and repeat rate sits in a narrow 2.9%-3.4% band across every major state. The top 5% of customers by lifetime spend (≥R$420; 29% of revenue) show an 8.52% repeat rate vs. 0.97% for the lowest tier — but repeat buyers accumulate lifetime spend by definition. Grouped by the value of their first order instead, high spenders repeat at 2.19% vs. 3.19% for low spenders.</w:t>
       </w:r>
     </w:p>
     <w:p>
@@ -417,7 +417,7 @@
         <w:t xml:space="preserve">Business impact:  </w:t>
       </w:r>
       <w:r>
-        <w:t xml:space="preserve">A geographic loyalty campaign has no evidence behind it. A value-based one does: high-value customers are already ~9x more likely to return than low-value customers, suggesting a receptive audience already primed to repeat, rather than one that needs to be persuaded from a standing start.</w:t>
+        <w:t xml:space="preserve">Neither a geographic nor a value-based loyalty campaign is supported by the observed repeat rates alone. The top lifetime-spend tier is still the group with the most revenue at stake (29% of revenue), which makes it the sensible place to test retention outreach.</w:t>
       </w:r>
     </w:p>
     <w:p>
@@ -433,7 +433,7 @@
         <w:t xml:space="preserve">Recommendation:  </w:t>
       </w:r>
       <w:r>
-        <w:t xml:space="preserve">Pilot a loyalty or retention program (early access, personalized offers) targeted specifically at the top 5% of customers by historical spend, rather than a broad or geography-based campaign.</w:t>
+        <w:t xml:space="preserve">Run a controlled pilot of retention outreach (early access, personalized offers) for the top 5% of customers by historical spend, with a randomly held-out comparison group.</w:t>
       </w:r>
     </w:p>
     <w:p>
@@ -449,7 +449,7 @@
         <w:t xml:space="preserve">Expected outcome:  </w:t>
       </w:r>
       <w:r>
-        <w:t xml:space="preserve">This analysis identifies the correlation but does not establish why high-value customers repeat more often — a controlled pilot with a held-out comparison group is recommended before assuming the loyalty program itself will replicate this correlation as causation.</w:t>
+        <w:t xml:space="preserve">The pilot measures whether outreach changes repeat behavior; the historical data cannot answer that question on its own.</w:t>
       </w:r>
     </w:p>
     <w:p>
@@ -457,7 +457,7 @@
         <w:pBdr>
           <w:top w:val="single" w:color="666666" w:sz="4" w:space="8"/>
         </w:pBdr>
-        <w:spacing w:after="80" w:before="360"/>
+        <w:spacing w:before="360" w:after="80"/>
       </w:pPr>
       <w:r>
         <w:rPr>
@@ -496,43 +496,6 @@
 
 <file path=word/comments.xml><?xml version="1.0" encoding="utf-8"?>
 <w:comments xmlns:cx="http://schemas.microsoft.com/office/drawing/2014/chartex" xmlns:cx1="http://schemas.microsoft.com/office/drawing/2015/9/8/chartex" xmlns:cx2="http://schemas.microsoft.com/office/drawing/2015/10/21/chartex" xmlns:cx3="http://schemas.microsoft.com/office/drawing/2016/5/9/chartex" xmlns:cx4="http://schemas.microsoft.com/office/drawing/2016/5/10/chartex" xmlns:cx5="http://schemas.microsoft.com/office/drawing/2016/5/11/chartex" xmlns:cx6="http://schemas.microsoft.com/office/drawing/2016/5/12/chartex" xmlns:cx7="http://schemas.microsoft.com/office/drawing/2016/5/13/chartex" xmlns:cx8="http://schemas.microsoft.com/office/drawing/2016/5/14/chartex" xmlns:mc="http://schemas.openxmlformats.org/markup-compatibility/2006" xmlns:aink="http://schemas.microsoft.com/office/drawing/2016/ink" xmlns:am3d="http://schemas.microsoft.com/office/drawing/2017/model3d" xmlns:o="urn:schemas-microsoft-com:office:office" xmlns:r="http://schemas.openxmlformats.org/officeDocument/2006/relationships" xmlns:m="http://schemas.openxmlformats.org/officeDocument/2006/math" xmlns:v="urn:schemas-microsoft-com:vml" xmlns:wp14="http://schemas.microsoft.com/office/word/2010/wordprocessingDrawing" xmlns:wp="http://schemas.openxmlformats.org/drawingml/2006/wordprocessingDrawing" xmlns:w10="urn:schemas-microsoft-com:office:word" xmlns:w="http://schemas.openxmlformats.org/wordprocessingml/2006/main" xmlns:w14="http://schemas.microsoft.com/office/word/2010/wordml" xmlns:w15="http://schemas.microsoft.com/office/word/2012/wordml" xmlns:w16cex="http://schemas.microsoft.com/office/word/2018/wordml/cex" xmlns:w16cid="http://schemas.microsoft.com/office/word/2016/wordml/cid" xmlns:w16="http://schemas.microsoft.com/office/word/2018/wordml" xmlns:w16sdtdh="http://schemas.microsoft.com/office/word/2020/wordml/sdtdatahash" xmlns:w16se="http://schemas.microsoft.com/office/word/2015/wordml/symex" xmlns:wpg="http://schemas.microsoft.com/office/word/2010/wordprocessingGroup" xmlns:wpi="http://schemas.microsoft.com/office/word/2010/wordprocessingInk" xmlns:wne="http://schemas.microsoft.com/office/word/2006/wordml" xmlns:wps="http://schemas.microsoft.com/office/word/2010/wordprocessingShape"/>
-</file>
-
-<file path=word/endnotes.xml><?xml version="1.0" encoding="utf-8"?>
-<w:endnotes xmlns:wpc="http://schemas.microsoft.com/office/word/2010/wordprocessingCanvas" xmlns:mc="http://schemas.openxmlformats.org/markup-compatibility/2006" xmlns:o="urn:schemas-microsoft-com:office:office" xmlns:r="http://schemas.openxmlformats.org/officeDocument/2006/relationships" xmlns:m="http://schemas.openxmlformats.org/officeDocument/2006/math" xmlns:v="urn:schemas-microsoft-com:vml" xmlns:wp14="http://schemas.microsoft.com/office/word/2010/wordprocessingDrawing" xmlns:wp="http://schemas.openxmlformats.org/drawingml/2006/wordprocessingDrawing" xmlns:w10="urn:schemas-microsoft-com:office:word" xmlns:w="http://schemas.openxmlformats.org/wordprocessingml/2006/main" xmlns:w14="http://schemas.microsoft.com/office/word/2010/wordml" xmlns:w15="http://schemas.microsoft.com/office/word/2012/wordml" xmlns:wpg="http://schemas.microsoft.com/office/word/2010/wordprocessingGroup" xmlns:wpi="http://schemas.microsoft.com/office/word/2010/wordprocessingInk" xmlns:wne="http://schemas.microsoft.com/office/word/2006/wordml" xmlns:wps="http://schemas.microsoft.com/office/word/2010/wordprocessingShape" mc:Ignorable="w14 w15 wp14">
-  <w:endnote w:type="separator" w:id="-1">
-    <w:p>
-      <w:pPr>
-        <w:spacing w:after="0" w:line="240" w:lineRule="auto"/>
-      </w:pPr>
-      <w:r>
-        <w:rPr>
-          <w:rStyle w:val="EndnoteReference"/>
-        </w:rPr>
-        <w:endnoteRef/>
-      </w:r>
-      <w:r>
-        <w:separator/>
-      </w:r>
-    </w:p>
-  </w:endnote>
-  <w:endnote w:type="continuationSeparator" w:id="0">
-    <w:p>
-      <w:pPr>
-        <w:spacing w:after="0" w:line="240" w:lineRule="auto"/>
-      </w:pPr>
-      <w:r>
-        <w:rPr>
-          <w:rStyle w:val="EndnoteReference"/>
-        </w:rPr>
-        <w:endnoteRef/>
-      </w:r>
-      <w:r>
-        <w:continuationSeparator/>
-      </w:r>
-    </w:p>
-  </w:endnote>
-</w:endnotes>
 </file>
 
 <file path=word/footnotes.xml><?xml version="1.0" encoding="utf-8"?>
@@ -766,8 +729,8 @@
     <w:uiPriority w:val="99"/>
     <w:unhideWhenUsed/>
     <w:rPr>
+      <w:u w:val="single"/>
       <w:color w:val="0563C1"/>
-      <w:u w:val="single"/>
     </w:rPr>
   </w:style>
   <w:style w:type="character" w:styleId="FootnoteReference">
@@ -807,42 +770,5 @@
       <w:szCs w:val="20"/>
     </w:rPr>
   </w:style>
-  <w:style w:type="character" w:styleId="EndnoteReference">
-    <w:name w:val="endnote reference"/>
-    <w:basedOn w:val="DefaultParagraphFont"/>
-    <w:uiPriority w:val="99"/>
-    <w:semiHidden/>
-    <w:unhideWhenUsed/>
-    <w:rPr>
-      <w:vertAlign w:val="superscript"/>
-    </w:rPr>
-  </w:style>
-  <w:style w:type="paragraph" w:styleId="EndnoteText">
-    <w:name w:val="endnote text"/>
-    <w:basedOn w:val="Normal"/>
-    <w:link w:val="EndnoteTextChar"/>
-    <w:uiPriority w:val="99"/>
-    <w:semiHidden/>
-    <w:unhideWhenUsed/>
-    <w:pPr>
-      <w:spacing w:after="0" w:line="240" w:lineRule="auto"/>
-    </w:pPr>
-    <w:rPr>
-      <w:sz w:val="20"/>
-      <w:szCs w:val="20"/>
-    </w:rPr>
-  </w:style>
-  <w:style w:type="character" w:styleId="EndnoteTextChar">
-    <w:name w:val="Endnote Text Char"/>
-    <w:basedOn w:val="DefaultParagraphFont"/>
-    <w:link w:val="EndnoteText"/>
-    <w:uiPriority w:val="99"/>
-    <w:semiHidden/>
-    <w:unhideWhenUsed/>
-    <w:rPr>
-      <w:sz w:val="20"/>
-      <w:szCs w:val="20"/>
-    </w:rPr>
-  </w:style>
 </w:styles>
 </file>
</xml_diff>